<commit_message>
Add figures, system screenshots, and verified hypertension citation to paper
Figures 2, 4, 5 are generated from SVG sources; the 12 plates are captured from the running app with fictional sample residents (figures/src/shoot.mjs).

Co-Authored-By: Claude Opus 5.5 <noreply@anthropic.com>
</commit_message>
<xml_diff>
--- a/docs/paper/BHSMS_Capstone_Paper.docx
+++ b/docs/paper/BHSMS_Capstone_Paper.docx
@@ -2204,7 +2204,7 @@
           <w:b w:val="0"/>
           <w:i w:val="0"/>
         </w:rPr>
-        <w:t>The Input component encompasses the knowledge, software, and hardware requirements of the study. The knowledge requirements include the challenges of the current manual health monitoring system as reported by the respondents; the health programs that the system must support, namely the DOH Expanded Program on Immunization schedule, the four-visit antenatal care pathway, the Philippine clinical practice guidelines for hypertension (Philippine Heart Association–Philippine Society of Hypertension, 2020), and the World Health Organization’s body mass index cut-offs for Asian populations (WHO Expert Consultation, 2004); the requirements of the Data Privacy Act of 2012; and the theories that guide the study.</w:t>
+        <w:t>The Input component encompasses the knowledge, software, and hardware requirements of the study. The knowledge requirements include the challenges of the current manual health monitoring system as reported by the respondents; the health programs that the system must support, namely the DOH Expanded Program on Immunization schedule, the four-visit antenatal care pathway, the Philippine clinical practice guidelines for hypertension (Ona et al., 2021), and the World Health Organization’s body mass index cut-offs for Asian populations (WHO Expert Consultation, 2004); the requirements of the Data Privacy Act of 2012; and the theories that guide the study.</w:t>
       </w:r>
     </w:p>
     <w:p>
@@ -3711,15 +3711,43 @@
     </w:p>
     <w:p>
       <w:pPr>
-        <w:spacing w:line="259" w:lineRule="auto" w:before="0" w:after="120"/>
+        <w:keepNext/>
+        <w:spacing w:before="120"/>
         <w:jc w:val="center"/>
       </w:pPr>
       <w:r>
-        <w:rPr>
-          <w:b w:val="0"/>
-          <w:i/>
-        </w:rPr>
-        <w:t>[Insert the Prototype Development Cycle diagram from the original manuscript]</w:t>
+        <w:drawing>
+          <wp:inline xmlns:a="http://schemas.openxmlformats.org/drawingml/2006/main" xmlns:pic="http://schemas.openxmlformats.org/drawingml/2006/picture">
+            <wp:extent cx="5943600" cy="1832610"/>
+            <wp:docPr id="1" name="Picture 1"/>
+            <wp:cNvGraphicFramePr>
+              <a:graphicFrameLocks noChangeAspect="1"/>
+            </wp:cNvGraphicFramePr>
+            <a:graphic>
+              <a:graphicData uri="http://schemas.openxmlformats.org/drawingml/2006/picture">
+                <pic:pic>
+                  <pic:nvPicPr>
+                    <pic:cNvPr id="0" name="figure2_prototype.png"/>
+                    <pic:cNvPicPr/>
+                  </pic:nvPicPr>
+                  <pic:blipFill>
+                    <a:blip r:embed="rId10"/>
+                    <a:stretch>
+                      <a:fillRect/>
+                    </a:stretch>
+                  </pic:blipFill>
+                  <pic:spPr>
+                    <a:xfrm>
+                      <a:off x="0" y="0"/>
+                      <a:ext cx="5943600" cy="1832610"/>
+                    </a:xfrm>
+                    <a:prstGeom prst="rect"/>
+                  </pic:spPr>
+                </pic:pic>
+              </a:graphicData>
+            </a:graphic>
+          </wp:inline>
+        </w:drawing>
       </w:r>
     </w:p>
     <w:p>
@@ -13236,7 +13264,7 @@
           <w:b w:val="0"/>
           <w:i w:val="0"/>
         </w:rPr>
-        <w:t>Guided directly by the findings of Problem 1, the researchers designed and developed the Barangay Health Status Monitoring System following the Input–Process–Output framework and the Prototype Model described in Chapter II. Table 15 traces each identified challenge to the feature that addresses it. The subsections that follow present the architecture, the clinical rules, the database, the user roles, and each module of the system with its corresponding screen.</w:t>
+        <w:t>Guided directly by the findings of Problem 1, the researchers designed and developed the Barangay Health Status Monitoring System following the Input–Process–Output framework and the Prototype Model described in Chapter II. Table 15 traces each identified challenge to the feature that addresses it. The subsections that follow present the architecture, the clinical rules, the database, the user roles, and each module of the system with its corresponding screen. The screens shown in the plates contain fictional sample residents entered for demonstration, not actual patient records.</w:t>
       </w:r>
     </w:p>
     <w:p>
@@ -13816,15 +13844,43 @@
     </w:p>
     <w:p>
       <w:pPr>
-        <w:spacing w:line="259" w:lineRule="auto" w:before="0" w:after="120"/>
+        <w:keepNext/>
+        <w:spacing w:before="120"/>
         <w:jc w:val="center"/>
       </w:pPr>
       <w:r>
-        <w:rPr>
-          <w:b w:val="0"/>
-          <w:i/>
-        </w:rPr>
-        <w:t>[Insert diagram: Select resident → Enter 7 readings → Live evaluation → Save → Stored offline → Synced to cloud]</w:t>
+        <w:drawing>
+          <wp:inline xmlns:a="http://schemas.openxmlformats.org/drawingml/2006/main" xmlns:pic="http://schemas.openxmlformats.org/drawingml/2006/picture">
+            <wp:extent cx="4572000" cy="5565913"/>
+            <wp:docPr id="2" name="Picture 2"/>
+            <wp:cNvGraphicFramePr>
+              <a:graphicFrameLocks noChangeAspect="1"/>
+            </wp:cNvGraphicFramePr>
+            <a:graphic>
+              <a:graphicData uri="http://schemas.openxmlformats.org/drawingml/2006/picture">
+                <pic:pic>
+                  <pic:nvPicPr>
+                    <pic:cNvPr id="0" name="figure4_triage.png"/>
+                    <pic:cNvPicPr/>
+                  </pic:nvPicPr>
+                  <pic:blipFill>
+                    <a:blip r:embed="rId11"/>
+                    <a:stretch>
+                      <a:fillRect/>
+                    </a:stretch>
+                  </pic:blipFill>
+                  <pic:spPr>
+                    <a:xfrm>
+                      <a:off x="0" y="0"/>
+                      <a:ext cx="4572000" cy="5565913"/>
+                    </a:xfrm>
+                    <a:prstGeom prst="rect"/>
+                  </pic:spPr>
+                </pic:pic>
+              </a:graphicData>
+            </a:graphic>
+          </wp:inline>
+        </w:drawing>
       </w:r>
     </w:p>
     <w:p>
@@ -14613,15 +14669,43 @@
     </w:p>
     <w:p>
       <w:pPr>
-        <w:spacing w:line="259" w:lineRule="auto" w:before="0" w:after="120"/>
+        <w:keepNext/>
+        <w:spacing w:before="120"/>
         <w:jc w:val="center"/>
       </w:pPr>
       <w:r>
-        <w:rPr>
-          <w:b w:val="0"/>
-          <w:i/>
-        </w:rPr>
-        <w:t>[Insert ERD: profiles, households, residents, vital_signs, maternal_records, antenatal_visits, immunizations, disease_surveillance_reports, audit_logs]</w:t>
+        <w:drawing>
+          <wp:inline xmlns:a="http://schemas.openxmlformats.org/drawingml/2006/main" xmlns:pic="http://schemas.openxmlformats.org/drawingml/2006/picture">
+            <wp:extent cx="5943600" cy="4699000"/>
+            <wp:docPr id="3" name="Picture 3"/>
+            <wp:cNvGraphicFramePr>
+              <a:graphicFrameLocks noChangeAspect="1"/>
+            </wp:cNvGraphicFramePr>
+            <a:graphic>
+              <a:graphicData uri="http://schemas.openxmlformats.org/drawingml/2006/picture">
+                <pic:pic>
+                  <pic:nvPicPr>
+                    <pic:cNvPr id="0" name="figure5_erd.png"/>
+                    <pic:cNvPicPr/>
+                  </pic:nvPicPr>
+                  <pic:blipFill>
+                    <a:blip r:embed="rId12"/>
+                    <a:stretch>
+                      <a:fillRect/>
+                    </a:stretch>
+                  </pic:blipFill>
+                  <pic:spPr>
+                    <a:xfrm>
+                      <a:off x="0" y="0"/>
+                      <a:ext cx="5943600" cy="4699000"/>
+                    </a:xfrm>
+                    <a:prstGeom prst="rect"/>
+                  </pic:spPr>
+                </pic:pic>
+              </a:graphicData>
+            </a:graphic>
+          </wp:inline>
+        </w:drawing>
       </w:r>
     </w:p>
     <w:p>
@@ -14929,15 +15013,43 @@
     </w:p>
     <w:p>
       <w:pPr>
-        <w:spacing w:line="259" w:lineRule="auto" w:before="0" w:after="120"/>
+        <w:keepNext/>
+        <w:spacing w:before="120"/>
         <w:jc w:val="center"/>
       </w:pPr>
       <w:r>
-        <w:rPr>
-          <w:b w:val="0"/>
-          <w:i/>
-        </w:rPr>
-        <w:t>[Insert screenshot — Sign-In Page]</w:t>
+        <w:drawing>
+          <wp:inline xmlns:a="http://schemas.openxmlformats.org/drawingml/2006/main" xmlns:pic="http://schemas.openxmlformats.org/drawingml/2006/picture">
+            <wp:extent cx="5943600" cy="3714750"/>
+            <wp:docPr id="4" name="Picture 4"/>
+            <wp:cNvGraphicFramePr>
+              <a:graphicFrameLocks noChangeAspect="1"/>
+            </wp:cNvGraphicFramePr>
+            <a:graphic>
+              <a:graphicData uri="http://schemas.openxmlformats.org/drawingml/2006/picture">
+                <pic:pic>
+                  <pic:nvPicPr>
+                    <pic:cNvPr id="0" name="plate01_signin.png"/>
+                    <pic:cNvPicPr/>
+                  </pic:nvPicPr>
+                  <pic:blipFill>
+                    <a:blip r:embed="rId13"/>
+                    <a:stretch>
+                      <a:fillRect/>
+                    </a:stretch>
+                  </pic:blipFill>
+                  <pic:spPr>
+                    <a:xfrm>
+                      <a:off x="0" y="0"/>
+                      <a:ext cx="5943600" cy="3714750"/>
+                    </a:xfrm>
+                    <a:prstGeom prst="rect"/>
+                  </pic:spPr>
+                </pic:pic>
+              </a:graphicData>
+            </a:graphic>
+          </wp:inline>
+        </w:drawing>
       </w:r>
     </w:p>
     <w:p>
@@ -14952,15 +15064,43 @@
     </w:p>
     <w:p>
       <w:pPr>
-        <w:spacing w:line="259" w:lineRule="auto" w:before="0" w:after="120"/>
+        <w:keepNext/>
+        <w:spacing w:before="120"/>
         <w:jc w:val="center"/>
       </w:pPr>
       <w:r>
-        <w:rPr>
-          <w:b w:val="0"/>
-          <w:i/>
-        </w:rPr>
-        <w:t>[Insert screenshot — Role-Based Dashboard]</w:t>
+        <w:drawing>
+          <wp:inline xmlns:a="http://schemas.openxmlformats.org/drawingml/2006/main" xmlns:pic="http://schemas.openxmlformats.org/drawingml/2006/picture">
+            <wp:extent cx="5943600" cy="3714750"/>
+            <wp:docPr id="5" name="Picture 5"/>
+            <wp:cNvGraphicFramePr>
+              <a:graphicFrameLocks noChangeAspect="1"/>
+            </wp:cNvGraphicFramePr>
+            <a:graphic>
+              <a:graphicData uri="http://schemas.openxmlformats.org/drawingml/2006/picture">
+                <pic:pic>
+                  <pic:nvPicPr>
+                    <pic:cNvPr id="0" name="plate02_dashboard.png"/>
+                    <pic:cNvPicPr/>
+                  </pic:nvPicPr>
+                  <pic:blipFill>
+                    <a:blip r:embed="rId14"/>
+                    <a:stretch>
+                      <a:fillRect/>
+                    </a:stretch>
+                  </pic:blipFill>
+                  <pic:spPr>
+                    <a:xfrm>
+                      <a:off x="0" y="0"/>
+                      <a:ext cx="5943600" cy="3714750"/>
+                    </a:xfrm>
+                    <a:prstGeom prst="rect"/>
+                  </pic:spPr>
+                </pic:pic>
+              </a:graphicData>
+            </a:graphic>
+          </wp:inline>
+        </w:drawing>
       </w:r>
     </w:p>
     <w:p>
@@ -15000,15 +15140,43 @@
     </w:p>
     <w:p>
       <w:pPr>
-        <w:spacing w:line="259" w:lineRule="auto" w:before="0" w:after="120"/>
+        <w:keepNext/>
+        <w:spacing w:before="120"/>
         <w:jc w:val="center"/>
       </w:pPr>
       <w:r>
-        <w:rPr>
-          <w:b w:val="0"/>
-          <w:i/>
-        </w:rPr>
-        <w:t>[Insert screenshot — Resident Registry]</w:t>
+        <w:drawing>
+          <wp:inline xmlns:a="http://schemas.openxmlformats.org/drawingml/2006/main" xmlns:pic="http://schemas.openxmlformats.org/drawingml/2006/picture">
+            <wp:extent cx="5943600" cy="3714750"/>
+            <wp:docPr id="6" name="Picture 6"/>
+            <wp:cNvGraphicFramePr>
+              <a:graphicFrameLocks noChangeAspect="1"/>
+            </wp:cNvGraphicFramePr>
+            <a:graphic>
+              <a:graphicData uri="http://schemas.openxmlformats.org/drawingml/2006/picture">
+                <pic:pic>
+                  <pic:nvPicPr>
+                    <pic:cNvPr id="0" name="plate03_registry.png"/>
+                    <pic:cNvPicPr/>
+                  </pic:nvPicPr>
+                  <pic:blipFill>
+                    <a:blip r:embed="rId15"/>
+                    <a:stretch>
+                      <a:fillRect/>
+                    </a:stretch>
+                  </pic:blipFill>
+                  <pic:spPr>
+                    <a:xfrm>
+                      <a:off x="0" y="0"/>
+                      <a:ext cx="5943600" cy="3714750"/>
+                    </a:xfrm>
+                    <a:prstGeom prst="rect"/>
+                  </pic:spPr>
+                </pic:pic>
+              </a:graphicData>
+            </a:graphic>
+          </wp:inline>
+        </w:drawing>
       </w:r>
     </w:p>
     <w:p>
@@ -15023,15 +15191,43 @@
     </w:p>
     <w:p>
       <w:pPr>
-        <w:spacing w:line="259" w:lineRule="auto" w:before="0" w:after="120"/>
+        <w:keepNext/>
+        <w:spacing w:before="120"/>
         <w:jc w:val="center"/>
       </w:pPr>
       <w:r>
-        <w:rPr>
-          <w:b w:val="0"/>
-          <w:i/>
-        </w:rPr>
-        <w:t>[Insert screenshot — New Patient Intake with Duplicate Warning]</w:t>
+        <w:drawing>
+          <wp:inline xmlns:a="http://schemas.openxmlformats.org/drawingml/2006/main" xmlns:pic="http://schemas.openxmlformats.org/drawingml/2006/picture">
+            <wp:extent cx="5943600" cy="3714750"/>
+            <wp:docPr id="7" name="Picture 7"/>
+            <wp:cNvGraphicFramePr>
+              <a:graphicFrameLocks noChangeAspect="1"/>
+            </wp:cNvGraphicFramePr>
+            <a:graphic>
+              <a:graphicData uri="http://schemas.openxmlformats.org/drawingml/2006/picture">
+                <pic:pic>
+                  <pic:nvPicPr>
+                    <pic:cNvPr id="0" name="plate04_intake.png"/>
+                    <pic:cNvPicPr/>
+                  </pic:nvPicPr>
+                  <pic:blipFill>
+                    <a:blip r:embed="rId16"/>
+                    <a:stretch>
+                      <a:fillRect/>
+                    </a:stretch>
+                  </pic:blipFill>
+                  <pic:spPr>
+                    <a:xfrm>
+                      <a:off x="0" y="0"/>
+                      <a:ext cx="5943600" cy="3714750"/>
+                    </a:xfrm>
+                    <a:prstGeom prst="rect"/>
+                  </pic:spPr>
+                </pic:pic>
+              </a:graphicData>
+            </a:graphic>
+          </wp:inline>
+        </w:drawing>
       </w:r>
     </w:p>
     <w:p>
@@ -15071,15 +15267,43 @@
     </w:p>
     <w:p>
       <w:pPr>
-        <w:spacing w:line="259" w:lineRule="auto" w:before="0" w:after="120"/>
+        <w:keepNext/>
+        <w:spacing w:before="120"/>
         <w:jc w:val="center"/>
       </w:pPr>
       <w:r>
-        <w:rPr>
-          <w:b w:val="0"/>
-          <w:i/>
-        </w:rPr>
-        <w:t>[Insert screenshot — Hemodynamic Screener and Triage]</w:t>
+        <w:drawing>
+          <wp:inline xmlns:a="http://schemas.openxmlformats.org/drawingml/2006/main" xmlns:pic="http://schemas.openxmlformats.org/drawingml/2006/picture">
+            <wp:extent cx="5943600" cy="3714750"/>
+            <wp:docPr id="8" name="Picture 8"/>
+            <wp:cNvGraphicFramePr>
+              <a:graphicFrameLocks noChangeAspect="1"/>
+            </wp:cNvGraphicFramePr>
+            <a:graphic>
+              <a:graphicData uri="http://schemas.openxmlformats.org/drawingml/2006/picture">
+                <pic:pic>
+                  <pic:nvPicPr>
+                    <pic:cNvPr id="0" name="plate05_vitals.png"/>
+                    <pic:cNvPicPr/>
+                  </pic:nvPicPr>
+                  <pic:blipFill>
+                    <a:blip r:embed="rId17"/>
+                    <a:stretch>
+                      <a:fillRect/>
+                    </a:stretch>
+                  </pic:blipFill>
+                  <pic:spPr>
+                    <a:xfrm>
+                      <a:off x="0" y="0"/>
+                      <a:ext cx="5943600" cy="3714750"/>
+                    </a:xfrm>
+                    <a:prstGeom prst="rect"/>
+                  </pic:spPr>
+                </pic:pic>
+              </a:graphicData>
+            </a:graphic>
+          </wp:inline>
+        </w:drawing>
       </w:r>
     </w:p>
     <w:p>
@@ -15119,15 +15343,43 @@
     </w:p>
     <w:p>
       <w:pPr>
-        <w:spacing w:line="259" w:lineRule="auto" w:before="0" w:after="120"/>
+        <w:keepNext/>
+        <w:spacing w:before="120"/>
         <w:jc w:val="center"/>
       </w:pPr>
       <w:r>
-        <w:rPr>
-          <w:b w:val="0"/>
-          <w:i/>
-        </w:rPr>
-        <w:t>[Insert screenshot — Medical Patient Chart]</w:t>
+        <w:drawing>
+          <wp:inline xmlns:a="http://schemas.openxmlformats.org/drawingml/2006/main" xmlns:pic="http://schemas.openxmlformats.org/drawingml/2006/picture">
+            <wp:extent cx="5943600" cy="3714750"/>
+            <wp:docPr id="9" name="Picture 9"/>
+            <wp:cNvGraphicFramePr>
+              <a:graphicFrameLocks noChangeAspect="1"/>
+            </wp:cNvGraphicFramePr>
+            <a:graphic>
+              <a:graphicData uri="http://schemas.openxmlformats.org/drawingml/2006/picture">
+                <pic:pic>
+                  <pic:nvPicPr>
+                    <pic:cNvPr id="0" name="plate06_chart.png"/>
+                    <pic:cNvPicPr/>
+                  </pic:nvPicPr>
+                  <pic:blipFill>
+                    <a:blip r:embed="rId18"/>
+                    <a:stretch>
+                      <a:fillRect/>
+                    </a:stretch>
+                  </pic:blipFill>
+                  <pic:spPr>
+                    <a:xfrm>
+                      <a:off x="0" y="0"/>
+                      <a:ext cx="5943600" cy="3714750"/>
+                    </a:xfrm>
+                    <a:prstGeom prst="rect"/>
+                  </pic:spPr>
+                </pic:pic>
+              </a:graphicData>
+            </a:graphic>
+          </wp:inline>
+        </w:drawing>
       </w:r>
     </w:p>
     <w:p>
@@ -15167,15 +15419,43 @@
     </w:p>
     <w:p>
       <w:pPr>
-        <w:spacing w:line="259" w:lineRule="auto" w:before="0" w:after="120"/>
+        <w:keepNext/>
+        <w:spacing w:before="120"/>
         <w:jc w:val="center"/>
       </w:pPr>
       <w:r>
-        <w:rPr>
-          <w:b w:val="0"/>
-          <w:i/>
-        </w:rPr>
-        <w:t>[Insert screenshot — Maternal Care and ANC Tracking]</w:t>
+        <w:drawing>
+          <wp:inline xmlns:a="http://schemas.openxmlformats.org/drawingml/2006/main" xmlns:pic="http://schemas.openxmlformats.org/drawingml/2006/picture">
+            <wp:extent cx="5943600" cy="3714750"/>
+            <wp:docPr id="10" name="Picture 10"/>
+            <wp:cNvGraphicFramePr>
+              <a:graphicFrameLocks noChangeAspect="1"/>
+            </wp:cNvGraphicFramePr>
+            <a:graphic>
+              <a:graphicData uri="http://schemas.openxmlformats.org/drawingml/2006/picture">
+                <pic:pic>
+                  <pic:nvPicPr>
+                    <pic:cNvPr id="0" name="plate07_maternal.png"/>
+                    <pic:cNvPicPr/>
+                  </pic:nvPicPr>
+                  <pic:blipFill>
+                    <a:blip r:embed="rId19"/>
+                    <a:stretch>
+                      <a:fillRect/>
+                    </a:stretch>
+                  </pic:blipFill>
+                  <pic:spPr>
+                    <a:xfrm>
+                      <a:off x="0" y="0"/>
+                      <a:ext cx="5943600" cy="3714750"/>
+                    </a:xfrm>
+                    <a:prstGeom prst="rect"/>
+                  </pic:spPr>
+                </pic:pic>
+              </a:graphicData>
+            </a:graphic>
+          </wp:inline>
+        </w:drawing>
       </w:r>
     </w:p>
     <w:p>
@@ -15215,15 +15495,43 @@
     </w:p>
     <w:p>
       <w:pPr>
-        <w:spacing w:line="259" w:lineRule="auto" w:before="0" w:after="120"/>
+        <w:keepNext/>
+        <w:spacing w:before="120"/>
         <w:jc w:val="center"/>
       </w:pPr>
       <w:r>
-        <w:rPr>
-          <w:b w:val="0"/>
-          <w:i/>
-        </w:rPr>
-        <w:t>[Insert screenshot — Child EPI and Defaulter List]</w:t>
+        <w:drawing>
+          <wp:inline xmlns:a="http://schemas.openxmlformats.org/drawingml/2006/main" xmlns:pic="http://schemas.openxmlformats.org/drawingml/2006/picture">
+            <wp:extent cx="5943600" cy="3714750"/>
+            <wp:docPr id="11" name="Picture 11"/>
+            <wp:cNvGraphicFramePr>
+              <a:graphicFrameLocks noChangeAspect="1"/>
+            </wp:cNvGraphicFramePr>
+            <a:graphic>
+              <a:graphicData uri="http://schemas.openxmlformats.org/drawingml/2006/picture">
+                <pic:pic>
+                  <pic:nvPicPr>
+                    <pic:cNvPr id="0" name="plate08_epi.png"/>
+                    <pic:cNvPicPr/>
+                  </pic:nvPicPr>
+                  <pic:blipFill>
+                    <a:blip r:embed="rId20"/>
+                    <a:stretch>
+                      <a:fillRect/>
+                    </a:stretch>
+                  </pic:blipFill>
+                  <pic:spPr>
+                    <a:xfrm>
+                      <a:off x="0" y="0"/>
+                      <a:ext cx="5943600" cy="3714750"/>
+                    </a:xfrm>
+                    <a:prstGeom prst="rect"/>
+                  </pic:spPr>
+                </pic:pic>
+              </a:graphicData>
+            </a:graphic>
+          </wp:inline>
+        </w:drawing>
       </w:r>
     </w:p>
     <w:p>
@@ -15263,15 +15571,43 @@
     </w:p>
     <w:p>
       <w:pPr>
-        <w:spacing w:line="259" w:lineRule="auto" w:before="0" w:after="120"/>
+        <w:keepNext/>
+        <w:spacing w:before="120"/>
         <w:jc w:val="center"/>
       </w:pPr>
       <w:r>
-        <w:rPr>
-          <w:b w:val="0"/>
-          <w:i/>
-        </w:rPr>
-        <w:t>[Insert screenshot — Referral Slip (RF-1)]</w:t>
+        <w:drawing>
+          <wp:inline xmlns:a="http://schemas.openxmlformats.org/drawingml/2006/main" xmlns:pic="http://schemas.openxmlformats.org/drawingml/2006/picture">
+            <wp:extent cx="5943600" cy="3714750"/>
+            <wp:docPr id="12" name="Picture 12"/>
+            <wp:cNvGraphicFramePr>
+              <a:graphicFrameLocks noChangeAspect="1"/>
+            </wp:cNvGraphicFramePr>
+            <a:graphic>
+              <a:graphicData uri="http://schemas.openxmlformats.org/drawingml/2006/picture">
+                <pic:pic>
+                  <pic:nvPicPr>
+                    <pic:cNvPr id="0" name="plate09_referral.png"/>
+                    <pic:cNvPicPr/>
+                  </pic:nvPicPr>
+                  <pic:blipFill>
+                    <a:blip r:embed="rId21"/>
+                    <a:stretch>
+                      <a:fillRect/>
+                    </a:stretch>
+                  </pic:blipFill>
+                  <pic:spPr>
+                    <a:xfrm>
+                      <a:off x="0" y="0"/>
+                      <a:ext cx="5943600" cy="3714750"/>
+                    </a:xfrm>
+                    <a:prstGeom prst="rect"/>
+                  </pic:spPr>
+                </pic:pic>
+              </a:graphicData>
+            </a:graphic>
+          </wp:inline>
+        </w:drawing>
       </w:r>
     </w:p>
     <w:p>
@@ -15311,15 +15647,43 @@
     </w:p>
     <w:p>
       <w:pPr>
-        <w:spacing w:line="259" w:lineRule="auto" w:before="0" w:after="120"/>
+        <w:keepNext/>
+        <w:spacing w:before="120"/>
         <w:jc w:val="center"/>
       </w:pPr>
       <w:r>
-        <w:rPr>
-          <w:b w:val="0"/>
-          <w:i/>
-        </w:rPr>
-        <w:t>[Insert screenshot — FHSIS Morbidity Surveillance]</w:t>
+        <w:drawing>
+          <wp:inline xmlns:a="http://schemas.openxmlformats.org/drawingml/2006/main" xmlns:pic="http://schemas.openxmlformats.org/drawingml/2006/picture">
+            <wp:extent cx="5943600" cy="3714750"/>
+            <wp:docPr id="13" name="Picture 13"/>
+            <wp:cNvGraphicFramePr>
+              <a:graphicFrameLocks noChangeAspect="1"/>
+            </wp:cNvGraphicFramePr>
+            <a:graphic>
+              <a:graphicData uri="http://schemas.openxmlformats.org/drawingml/2006/picture">
+                <pic:pic>
+                  <pic:nvPicPr>
+                    <pic:cNvPr id="0" name="plate10_analytics.png"/>
+                    <pic:cNvPicPr/>
+                  </pic:nvPicPr>
+                  <pic:blipFill>
+                    <a:blip r:embed="rId22"/>
+                    <a:stretch>
+                      <a:fillRect/>
+                    </a:stretch>
+                  </pic:blipFill>
+                  <pic:spPr>
+                    <a:xfrm>
+                      <a:off x="0" y="0"/>
+                      <a:ext cx="5943600" cy="3714750"/>
+                    </a:xfrm>
+                    <a:prstGeom prst="rect"/>
+                  </pic:spPr>
+                </pic:pic>
+              </a:graphicData>
+            </a:graphic>
+          </wp:inline>
+        </w:drawing>
       </w:r>
     </w:p>
     <w:p>
@@ -15359,15 +15723,43 @@
     </w:p>
     <w:p>
       <w:pPr>
-        <w:spacing w:line="259" w:lineRule="auto" w:before="0" w:after="120"/>
+        <w:keepNext/>
+        <w:spacing w:before="120"/>
         <w:jc w:val="center"/>
       </w:pPr>
       <w:r>
-        <w:rPr>
-          <w:b w:val="0"/>
-          <w:i/>
-        </w:rPr>
-        <w:t>[Insert screenshot — Workstation Diagnostics and Sync]</w:t>
+        <w:drawing>
+          <wp:inline xmlns:a="http://schemas.openxmlformats.org/drawingml/2006/main" xmlns:pic="http://schemas.openxmlformats.org/drawingml/2006/picture">
+            <wp:extent cx="5943600" cy="3714750"/>
+            <wp:docPr id="14" name="Picture 14"/>
+            <wp:cNvGraphicFramePr>
+              <a:graphicFrameLocks noChangeAspect="1"/>
+            </wp:cNvGraphicFramePr>
+            <a:graphic>
+              <a:graphicData uri="http://schemas.openxmlformats.org/drawingml/2006/picture">
+                <pic:pic>
+                  <pic:nvPicPr>
+                    <pic:cNvPr id="0" name="plate11_operations.png"/>
+                    <pic:cNvPicPr/>
+                  </pic:nvPicPr>
+                  <pic:blipFill>
+                    <a:blip r:embed="rId23"/>
+                    <a:stretch>
+                      <a:fillRect/>
+                    </a:stretch>
+                  </pic:blipFill>
+                  <pic:spPr>
+                    <a:xfrm>
+                      <a:off x="0" y="0"/>
+                      <a:ext cx="5943600" cy="3714750"/>
+                    </a:xfrm>
+                    <a:prstGeom prst="rect"/>
+                  </pic:spPr>
+                </pic:pic>
+              </a:graphicData>
+            </a:graphic>
+          </wp:inline>
+        </w:drawing>
       </w:r>
     </w:p>
     <w:p>
@@ -15407,15 +15799,43 @@
     </w:p>
     <w:p>
       <w:pPr>
-        <w:spacing w:line="259" w:lineRule="auto" w:before="0" w:after="120"/>
+        <w:keepNext/>
+        <w:spacing w:before="120"/>
         <w:jc w:val="center"/>
       </w:pPr>
       <w:r>
-        <w:rPr>
-          <w:b w:val="0"/>
-          <w:i/>
-        </w:rPr>
-        <w:t>[Insert screenshot — User Accounts and Module Permissions]</w:t>
+        <w:drawing>
+          <wp:inline xmlns:a="http://schemas.openxmlformats.org/drawingml/2006/main" xmlns:pic="http://schemas.openxmlformats.org/drawingml/2006/picture">
+            <wp:extent cx="5943600" cy="3714750"/>
+            <wp:docPr id="15" name="Picture 15"/>
+            <wp:cNvGraphicFramePr>
+              <a:graphicFrameLocks noChangeAspect="1"/>
+            </wp:cNvGraphicFramePr>
+            <a:graphic>
+              <a:graphicData uri="http://schemas.openxmlformats.org/drawingml/2006/picture">
+                <pic:pic>
+                  <pic:nvPicPr>
+                    <pic:cNvPr id="0" name="plate12_users.png"/>
+                    <pic:cNvPicPr/>
+                  </pic:nvPicPr>
+                  <pic:blipFill>
+                    <a:blip r:embed="rId24"/>
+                    <a:stretch>
+                      <a:fillRect/>
+                    </a:stretch>
+                  </pic:blipFill>
+                  <pic:spPr>
+                    <a:xfrm>
+                      <a:off x="0" y="0"/>
+                      <a:ext cx="5943600" cy="3714750"/>
+                    </a:xfrm>
+                    <a:prstGeom prst="rect"/>
+                  </pic:spPr>
+                </pic:pic>
+              </a:graphicData>
+            </a:graphic>
+          </wp:inline>
+        </w:drawing>
       </w:r>
     </w:p>
     <w:p>
@@ -18024,7 +18444,7 @@
           <w:b w:val="0"/>
           <w:i w:val="0"/>
         </w:rPr>
-        <w:t>Philippine Heart Association–Philippine Society of Hypertension. (2020). 2020 clinical practice guidelines for the management of hypertension in the Philippines.</w:t>
+        <w:t>Ona, D. I. D., Jimeno, C. A., Jasul, G. V., Jr., et al. (2021). Executive summary of the 2020 clinical practice guidelines for the management of hypertension in the Philippines. The Journal of Clinical Hypertension, 23(9), 1637–1650. https://doi.org/10.1111/jch.14335</w:t>
       </w:r>
     </w:p>
     <w:p>

</xml_diff>